<commit_message>
Notebook: clean re-clone in cell 0 to avoid stale checkout running old code
Co-Authored-By: Claude Opus 4.8 <noreply@anthropic.com>
</commit_message>
<xml_diff>
--- a/idea/plan V-JEPA football.docx
+++ b/idea/plan V-JEPA football.docx
@@ -17,6 +17,28 @@
     <w:p>
       <w:r>
         <w:t>aim: being able to converse with an agentic system about a football match</w:t>
+      </w:r>
+    </w:p>
+    <w:p/>
+    <w:p>
+      <w:r>
+        <w:t xml:space="preserve">hardware: juggle between Google </w:t>
+      </w:r>
+      <w:proofErr w:type="spellStart"/>
+      <w:r>
+        <w:t>Colab</w:t>
+      </w:r>
+      <w:proofErr w:type="spellEnd"/>
+      <w:r>
+        <w:t xml:space="preserve"> , Kaggle for now, maybe move later to </w:t>
+      </w:r>
+      <w:proofErr w:type="spellStart"/>
+      <w:r>
+        <w:t>Runpod</w:t>
+      </w:r>
+      <w:proofErr w:type="spellEnd"/>
+      <w:r>
+        <w:t xml:space="preserve"> for longer tasks</w:t>
       </w:r>
     </w:p>
     <w:p/>
@@ -82,7 +104,15 @@
     <w:p/>
     <w:p>
       <w:r>
-        <w:t>Use dataset of Soccernet: action spotting labels</w:t>
+        <w:t xml:space="preserve">Use dataset of </w:t>
+      </w:r>
+      <w:proofErr w:type="spellStart"/>
+      <w:r>
+        <w:t>Soccernet</w:t>
+      </w:r>
+      <w:proofErr w:type="spellEnd"/>
+      <w:r>
+        <w:t>: action spotting labels</w:t>
       </w:r>
     </w:p>
     <w:p>
@@ -117,9 +147,11 @@
             <w:tcW w:w="3021" w:type="dxa"/>
           </w:tcPr>
           <w:p>
+            <w:proofErr w:type="spellStart"/>
             <w:r>
               <w:t>VideoMAE</w:t>
             </w:r>
+            <w:proofErr w:type="spellEnd"/>
           </w:p>
         </w:tc>
         <w:tc>
@@ -158,7 +190,15 @@
     <w:p/>
     <w:p>
       <w:r>
-        <w:t>Take a clip of YouTube of WorldCup and see it for myself</w:t>
+        <w:t xml:space="preserve">Take a clip of YouTube of </w:t>
+      </w:r>
+      <w:proofErr w:type="spellStart"/>
+      <w:r>
+        <w:t>WorldCup</w:t>
+      </w:r>
+      <w:proofErr w:type="spellEnd"/>
+      <w:r>
+        <w:t xml:space="preserve"> and see it for myself</w:t>
       </w:r>
     </w:p>
     <w:p/>
@@ -169,7 +209,15 @@
     </w:p>
     <w:p>
       <w:r>
-        <w:t>Use dataset of Soccernet: dense video captioning title</w:t>
+        <w:t xml:space="preserve">Use dataset of </w:t>
+      </w:r>
+      <w:proofErr w:type="spellStart"/>
+      <w:r>
+        <w:t>Soccernet</w:t>
+      </w:r>
+      <w:proofErr w:type="spellEnd"/>
+      <w:r>
+        <w:t>: dense video captioning title</w:t>
       </w:r>
     </w:p>
     <w:p>
@@ -195,6 +243,7 @@
           </w:tcPr>
           <w:p>
             <w:r>
+              <w:lastRenderedPageBreak/>
               <w:t>Resnet</w:t>
             </w:r>
           </w:p>
@@ -204,9 +253,11 @@
             <w:tcW w:w="3021" w:type="dxa"/>
           </w:tcPr>
           <w:p>
+            <w:proofErr w:type="spellStart"/>
             <w:r>
               <w:t>VideoMAE</w:t>
             </w:r>
+            <w:proofErr w:type="spellEnd"/>
           </w:p>
         </w:tc>
         <w:tc>
@@ -264,8 +315,15 @@
     <w:p/>
     <w:p>
       <w:r>
-        <w:lastRenderedPageBreak/>
-        <w:t>testing “sematically searching” in the football match -&gt; can this become possible with a few modifications</w:t>
+        <w:t>testing “</w:t>
+      </w:r>
+      <w:proofErr w:type="spellStart"/>
+      <w:r>
+        <w:t>sematically</w:t>
+      </w:r>
+      <w:proofErr w:type="spellEnd"/>
+      <w:r>
+        <w:t xml:space="preserve"> searching” in the football match -&gt; can this become possible with a few modifications</w:t>
       </w:r>
     </w:p>
     <w:p>

</xml_diff>